<commit_message>
auto(daily): dev loop report 2026-06-05
</commit_message>
<xml_diff>
--- a/reports/hypothesis/2026-06-05.docx
+++ b/reports/hypothesis/2026-06-05.docx
@@ -15,7 +15,7 @@
         <w:rPr>
           <w:i/>
         </w:rPr>
-        <w:t>생성일: 2026-06-05 09:15 KST  |  표본: 측정소당 최소 2268건 / 총 11515건</w:t>
+        <w:t>생성일: 2026-06-05 13:45 KST  |  표본: 측정소당 최소 2273건 / 총 11540건</w:t>
       </w:r>
     </w:p>
     <w:p>
@@ -143,7 +143,7 @@
           </w:tcPr>
           <w:p>
             <w:r>
-              <w:t>38.049</w:t>
+              <w:t>37.994</w:t>
             </w:r>
           </w:p>
         </w:tc>
@@ -153,7 +153,7 @@
           </w:tcPr>
           <w:p>
             <w:r>
-              <w:t>33.968</w:t>
+              <w:t>33.913</w:t>
             </w:r>
           </w:p>
         </w:tc>
@@ -163,7 +163,7 @@
           </w:tcPr>
           <w:p>
             <w:r>
-              <w:t>+4.082</w:t>
+              <w:t>+4.080</w:t>
             </w:r>
           </w:p>
         </w:tc>
@@ -215,7 +215,7 @@
           </w:tcPr>
           <w:p>
             <w:r>
-              <w:t>21.226</w:t>
+              <w:t>21.191</w:t>
             </w:r>
           </w:p>
         </w:tc>
@@ -225,7 +225,7 @@
           </w:tcPr>
           <w:p>
             <w:r>
-              <w:t>17.857</w:t>
+              <w:t>17.831</w:t>
             </w:r>
           </w:p>
         </w:tc>
@@ -235,7 +235,7 @@
           </w:tcPr>
           <w:p>
             <w:r>
-              <w:t>+3.369</w:t>
+              <w:t>+3.360</w:t>
             </w:r>
           </w:p>
         </w:tc>
@@ -503,7 +503,7 @@
           </w:tcPr>
           <w:p>
             <w:r>
-              <w:t>0.429</w:t>
+              <w:t>0.428</w:t>
             </w:r>
           </w:p>
         </w:tc>
@@ -660,7 +660,7 @@
           </w:tcPr>
           <w:p>
             <w:r>
-              <w:t>39.31</w:t>
+              <w:t>39.30</w:t>
             </w:r>
           </w:p>
         </w:tc>
@@ -722,7 +722,7 @@
           </w:tcPr>
           <w:p>
             <w:r>
-              <w:t>77.87</w:t>
+              <w:t>77.48</w:t>
             </w:r>
           </w:p>
         </w:tc>
@@ -784,7 +784,7 @@
           </w:tcPr>
           <w:p>
             <w:r>
-              <w:t>14.66</w:t>
+              <w:t>14.47</w:t>
             </w:r>
           </w:p>
         </w:tc>
@@ -846,7 +846,7 @@
           </w:tcPr>
           <w:p>
             <w:r>
-              <w:t>146.67</w:t>
+              <w:t>146.79</w:t>
             </w:r>
           </w:p>
         </w:tc>
@@ -908,7 +908,7 @@
           </w:tcPr>
           <w:p>
             <w:r>
-              <w:t>71.24</w:t>
+              <w:t>70.83</w:t>
             </w:r>
           </w:p>
         </w:tc>
@@ -970,7 +970,7 @@
           </w:tcPr>
           <w:p>
             <w:r>
-              <w:t>155.56</w:t>
+              <w:t>154.66</w:t>
             </w:r>
           </w:p>
         </w:tc>
@@ -1029,7 +1029,7 @@
         <w:pStyle w:val="ListBullet"/>
       </w:pPr>
       <w:r>
-        <w:t>'산단 영향군'가 '베이스라인'보다 평균 3.37 높음 (p=0.0000, 효과크기 작음 d=0.25).</w:t>
+        <w:t>'산단 영향군'가 '베이스라인'보다 평균 3.36 높음 (p=0.0000, 효과크기 작음 d=0.25).</w:t>
       </w:r>
     </w:p>
     <w:p>

</xml_diff>